<commit_message>
IP Sale Tracker rev 2: withdraw the three-gate rule; it was my error not an execution gap
</commit_message>
<xml_diff>
--- a/research/IP_SALE_TRACKER.docx
+++ b/research/IP_SALE_TRACKER.docx
@@ -96,7 +96,7 @@
               <w:spacing w:after="0"/>
             </w:pPr>
             <w:r>
-              <w:t xml:space="preserve">2026-08-13</w:t>
+              <w:t xml:space="preserve">2026-08-13 (rev 2)</w:t>
             </w:r>
           </w:p>
         </w:tc>
@@ -127,7 +127,7 @@
               <w:spacing w:after="0"/>
             </w:pPr>
             <w:r>
-              <w:t xml:space="preserve">1</w:t>
+              <w:t xml:space="preserve">2</w:t>
             </w:r>
           </w:p>
         </w:tc>
@@ -161,10 +161,7 @@
               <w:rPr>
                 <w:b/>
               </w:rPr>
-              <w:t xml:space="preserve">Stage 1 not started.</w:t>
-            </w:r>
-            <w:r>
-              <w:t xml:space="preserve"> Zero buyer conversations held</w:t>
+              <w:t xml:space="preserve">Zero buyer conversations held, because I advised waiting. Gate withdrawn 2026-08-13</w:t>
             </w:r>
           </w:p>
         </w:tc>
@@ -878,7 +875,7 @@
         <w:spacing w:after="140"/>
       </w:pPr>
       <w:r>
-        <w:t xml:space="preserve">3. THE GATE: owner's own Stage 2 trigger</w:t>
+        <w:t xml:space="preserve">3. THE GATE: WITHDRAWN. IT WAS MY ERROR, NOT AN EXECUTION FAILURE</w:t>
       </w:r>
     </w:p>
     <w:p>
@@ -886,8 +883,16 @@
         <w:spacing w:after="140"/>
       </w:pPr>
       <w:r>
-        <w:t xml:space="preserve">From </w:t>
-      </w:r>
+        <w:rPr>
+          <w:b/>
+        </w:rPr>
+        <w:t xml:space="preserve">Revision 2 correction. Revision 1 of this file recorded "Stage 1 not started" as the owner's largest execution gap. That was wrong and unfair, and the reason is in my own advice.</w:t>
+      </w:r>
+    </w:p>
+    <w:p>
+      <w:pPr>
+        <w:spacing w:after="140"/>
+      </w:pPr>
       <w:r>
         <w:rPr>
           <w:rFonts w:ascii="Consolas" w:hAnsi="Consolas"/>
@@ -895,16 +900,95 @@
         <w:t xml:space="preserve">Path_to_Sale_Action_Plan.md</w:t>
       </w:r>
       <w:r>
-        <w:t xml:space="preserve">, the formal process opens when </w:t>
+        <w:t xml:space="preserve">, written 2026-08-01, set </w:t>
       </w:r>
       <w:r>
         <w:rPr>
           <w:b/>
         </w:rPr>
-        <w:t xml:space="preserve">all three</w:t>
-      </w:r>
-      <w:r>
-        <w:t xml:space="preserve"> are true:</w:t>
+        <w:t xml:space="preserve">three gates before the formal buyer process</w:t>
+      </w:r>
+      <w:r>
+        <w:t xml:space="preserve">: one publication accepted, </w:t>
+      </w:r>
+      <w:r>
+        <w:rPr>
+          <w:b/>
+        </w:rPr>
+        <w:t xml:space="preserve">marks filed</w:t>
+      </w:r>
+      <w:r>
+        <w:t xml:space="preserve">, and </w:t>
+      </w:r>
+      <w:r>
+        <w:rPr>
+          <w:b/>
+        </w:rPr>
+        <w:t xml:space="preserve">one paying pilot</w:t>
+      </w:r>
+      <w:r>
+        <w:t xml:space="preserve">. Whatever Stage 1 said about "warm conversations", a document that lists three prerequisites before buyer outreach reads, correctly, as </w:t>
+      </w:r>
+      <w:r>
+        <w:rPr>
+          <w:i/>
+        </w:rPr>
+        <w:t xml:space="preserve">do not approach buyers yet</w:t>
+      </w:r>
+      <w:r>
+        <w:t xml:space="preserve">. </w:t>
+      </w:r>
+      <w:r>
+        <w:rPr>
+          <w:b/>
+        </w:rPr>
+        <w:t xml:space="preserve">The owner followed the plan he was given.</w:t>
+      </w:r>
+    </w:p>
+    <w:p>
+      <w:pPr>
+        <w:spacing w:after="140"/>
+      </w:pPr>
+      <w:r>
+        <w:rPr>
+          <w:b/>
+        </w:rPr>
+        <w:t xml:space="preserve">It then got worse, and that is also mine.</w:t>
+      </w:r>
+      <w:r>
+        <w:t xml:space="preserve"> On 2026-08-13 I advised holding the trademark filings on a trigger rule. </w:t>
+      </w:r>
+      <w:r>
+        <w:rPr>
+          <w:b/>
+        </w:rPr>
+        <w:t xml:space="preserve">That deferred gate 2 indefinitely</w:t>
+      </w:r>
+      <w:r>
+        <w:t xml:space="preserve">, so my own later advice made a gate of my own making unreachable. Meanwhile the consulting and federal-training channels I proposed all tested negative.</w:t>
+      </w:r>
+    </w:p>
+    <w:p>
+      <w:pPr>
+        <w:spacing w:after="140"/>
+      </w:pPr>
+      <w:r>
+        <w:rPr>
+          <w:b/>
+        </w:rPr>
+        <w:t xml:space="preserve">Net effect: my advice is the reason no buyer has been approached.</w:t>
+      </w:r>
+      <w:r>
+        <w:t xml:space="preserve"> The owner asked, was told it was too early, and complied.</w:t>
+      </w:r>
+    </w:p>
+    <w:p>
+      <w:pPr>
+        <w:pStyle w:val="Heading3"/>
+        <w:spacing w:after="140"/>
+      </w:pPr>
+      <w:r>
+        <w:t xml:space="preserve">The gates, re-examined honestly</w:t>
       </w:r>
     </w:p>
     <w:tbl>
@@ -921,14 +1005,13 @@
         </w:tblBorders>
       </w:tblPr>
       <w:tblGrid>
-        <w:gridCol w:w="3120"/>
-        <w:gridCol w:w="3120"/>
-        <w:gridCol w:w="3120"/>
+        <w:gridCol w:w="4680"/>
+        <w:gridCol w:w="4680"/>
       </w:tblGrid>
       <w:tr>
         <w:tc>
           <w:tcPr>
-            <w:tcW w:w="3120" w:type="dxa"/>
+            <w:tcW w:w="4680" w:type="dxa"/>
           </w:tcPr>
           <w:p>
             <w:pPr>
@@ -941,195 +1024,116 @@
         </w:tc>
         <w:tc>
           <w:tcPr>
-            <w:tcW w:w="3120" w:type="dxa"/>
-          </w:tcPr>
-          <w:p>
-            <w:pPr>
-              <w:spacing w:after="0"/>
-            </w:pPr>
-            <w:r>
-              <w:t xml:space="preserve">Required</w:t>
-            </w:r>
-          </w:p>
-        </w:tc>
-        <w:tc>
-          <w:tcPr>
-            <w:tcW w:w="3120" w:type="dxa"/>
-          </w:tcPr>
-          <w:p>
-            <w:pPr>
-              <w:spacing w:after="0"/>
-            </w:pPr>
-            <w:r>
-              <w:t xml:space="preserve">Status</w:t>
-            </w:r>
-          </w:p>
-        </w:tc>
-      </w:tr>
-      <w:tr>
-        <w:tc>
-          <w:tcPr>
-            <w:tcW w:w="3120" w:type="dxa"/>
-          </w:tcPr>
-          <w:p>
-            <w:pPr>
-              <w:spacing w:after="0"/>
-            </w:pPr>
-            <w:r>
-              <w:t xml:space="preserve">One publication </w:t>
-            </w:r>
-            <w:r>
-              <w:rPr>
-                <w:b/>
-              </w:rPr>
-              <w:t xml:space="preserve">accepted or in-press</w:t>
-            </w:r>
-          </w:p>
-        </w:tc>
-        <w:tc>
-          <w:tcPr>
-            <w:tcW w:w="3120" w:type="dxa"/>
-          </w:tcPr>
-          <w:p>
-            <w:pPr>
-              <w:spacing w:after="0"/>
-            </w:pPr>
-            <w:r>
-              <w:t xml:space="preserve">yes</w:t>
-            </w:r>
-          </w:p>
-        </w:tc>
-        <w:tc>
-          <w:tcPr>
-            <w:tcW w:w="3120" w:type="dxa"/>
-          </w:tcPr>
-          <w:p>
-            <w:pPr>
-              <w:spacing w:after="0"/>
-            </w:pPr>
-            <w:r>
-              <w:t xml:space="preserve">✅ </w:t>
-            </w:r>
-            <w:r>
-              <w:rPr>
-                <w:b/>
-              </w:rPr>
-              <w:t xml:space="preserve">MET.</w:t>
-            </w:r>
-            <w:r>
-              <w:t xml:space="preserve"> "When the Record Cannot Speak for Itself", CEP Magazine (SCCE), accepted 2026-07-16, copy-editing from 07-21, November issue</w:t>
-            </w:r>
-          </w:p>
-        </w:tc>
-      </w:tr>
-      <w:tr>
-        <w:tc>
-          <w:tcPr>
-            <w:tcW w:w="3120" w:type="dxa"/>
-          </w:tcPr>
-          <w:p>
-            <w:pPr>
-              <w:spacing w:after="0"/>
-            </w:pPr>
-            <w:r>
-              <w:t xml:space="preserve">Marks </w:t>
-            </w:r>
-            <w:r>
-              <w:rPr>
-                <w:b/>
-              </w:rPr>
-              <w:t xml:space="preserve">filed</w:t>
-            </w:r>
-          </w:p>
-        </w:tc>
-        <w:tc>
-          <w:tcPr>
-            <w:tcW w:w="3120" w:type="dxa"/>
-          </w:tcPr>
-          <w:p>
-            <w:pPr>
-              <w:spacing w:after="0"/>
-            </w:pPr>
-            <w:r>
-              <w:t xml:space="preserve">yes</w:t>
-            </w:r>
-          </w:p>
-        </w:tc>
-        <w:tc>
-          <w:tcPr>
-            <w:tcW w:w="3120" w:type="dxa"/>
-          </w:tcPr>
-          <w:p>
-            <w:pPr>
-              <w:spacing w:after="0"/>
-            </w:pPr>
-            <w:r>
-              <w:t xml:space="preserve">❌ </w:t>
-            </w:r>
-            <w:r>
-              <w:rPr>
-                <w:b/>
-              </w:rPr>
-              <w:t xml:space="preserve">NOT MET.</w:t>
-            </w:r>
-            <w:r>
-              <w:t xml:space="preserve"> Neither JRS nor DRR filed. Currently on a trigger-rule hold</w:t>
-            </w:r>
-          </w:p>
-        </w:tc>
-      </w:tr>
-      <w:tr>
-        <w:tc>
-          <w:tcPr>
-            <w:tcW w:w="3120" w:type="dxa"/>
-          </w:tcPr>
-          <w:p>
-            <w:pPr>
-              <w:spacing w:after="0"/>
-            </w:pPr>
-            <w:r>
-              <w:t xml:space="preserve">One </w:t>
-            </w:r>
-            <w:r>
-              <w:rPr>
-                <w:b/>
-              </w:rPr>
-              <w:t xml:space="preserve">paying pilot</w:t>
-            </w:r>
-          </w:p>
-        </w:tc>
-        <w:tc>
-          <w:tcPr>
-            <w:tcW w:w="3120" w:type="dxa"/>
-          </w:tcPr>
-          <w:p>
-            <w:pPr>
-              <w:spacing w:after="0"/>
-            </w:pPr>
-            <w:r>
-              <w:t xml:space="preserve">yes</w:t>
-            </w:r>
-          </w:p>
-        </w:tc>
-        <w:tc>
-          <w:tcPr>
-            <w:tcW w:w="3120" w:type="dxa"/>
-          </w:tcPr>
-          <w:p>
-            <w:pPr>
-              <w:spacing w:after="0"/>
-            </w:pPr>
-            <w:r>
-              <w:t xml:space="preserve">❌ </w:t>
-            </w:r>
-            <w:r>
-              <w:rPr>
-                <w:b/>
-              </w:rPr>
-              <w:t xml:space="preserve">NOT MET.</w:t>
-            </w:r>
-            <w:r>
-              <w:t xml:space="preserve"> 0 organizations, 0 sessions, 0 records run</w:t>
+            <w:tcW w:w="4680" w:type="dxa"/>
+          </w:tcPr>
+          <w:p>
+            <w:pPr>
+              <w:spacing w:after="0"/>
+            </w:pPr>
+            <w:r>
+              <w:t xml:space="preserve">Real prerequisite for TALKING to a buyer?</w:t>
+            </w:r>
+          </w:p>
+        </w:tc>
+      </w:tr>
+      <w:tr>
+        <w:tc>
+          <w:tcPr>
+            <w:tcW w:w="4680" w:type="dxa"/>
+          </w:tcPr>
+          <w:p>
+            <w:pPr>
+              <w:spacing w:after="0"/>
+            </w:pPr>
+            <w:r>
+              <w:t xml:space="preserve">Publication accepted</w:t>
+            </w:r>
+          </w:p>
+        </w:tc>
+        <w:tc>
+          <w:tcPr>
+            <w:tcW w:w="4680" w:type="dxa"/>
+          </w:tcPr>
+          <w:p>
+            <w:pPr>
+              <w:spacing w:after="0"/>
+            </w:pPr>
+            <w:r>
+              <w:rPr>
+                <w:b/>
+              </w:rPr>
+              <w:t xml:space="preserve">No.</w:t>
+            </w:r>
+            <w:r>
+              <w:t xml:space="preserve"> Helpful. Not required</w:t>
+            </w:r>
+          </w:p>
+        </w:tc>
+      </w:tr>
+      <w:tr>
+        <w:tc>
+          <w:tcPr>
+            <w:tcW w:w="4680" w:type="dxa"/>
+          </w:tcPr>
+          <w:p>
+            <w:pPr>
+              <w:spacing w:after="0"/>
+            </w:pPr>
+            <w:r>
+              <w:t xml:space="preserve">Marks filed</w:t>
+            </w:r>
+          </w:p>
+        </w:tc>
+        <w:tc>
+          <w:tcPr>
+            <w:tcW w:w="4680" w:type="dxa"/>
+          </w:tcPr>
+          <w:p>
+            <w:pPr>
+              <w:spacing w:after="0"/>
+            </w:pPr>
+            <w:r>
+              <w:rPr>
+                <w:b/>
+              </w:rPr>
+              <w:t xml:space="preserve">No.</w:t>
+            </w:r>
+            <w:r>
+              <w:t xml:space="preserve"> Buyers do not require pending trademarks to hold a conversation</w:t>
+            </w:r>
+          </w:p>
+        </w:tc>
+      </w:tr>
+      <w:tr>
+        <w:tc>
+          <w:tcPr>
+            <w:tcW w:w="4680" w:type="dxa"/>
+          </w:tcPr>
+          <w:p>
+            <w:pPr>
+              <w:spacing w:after="0"/>
+            </w:pPr>
+            <w:r>
+              <w:t xml:space="preserve">One paying pilot</w:t>
+            </w:r>
+          </w:p>
+        </w:tc>
+        <w:tc>
+          <w:tcPr>
+            <w:tcW w:w="4680" w:type="dxa"/>
+          </w:tcPr>
+          <w:p>
+            <w:pPr>
+              <w:spacing w:after="0"/>
+            </w:pPr>
+            <w:r>
+              <w:rPr>
+                <w:b/>
+              </w:rPr>
+              <w:t xml:space="preserve">No.</w:t>
+            </w:r>
+            <w:r>
+              <w:t xml:space="preserve"> It raises price. It does not gate a conversation</w:t>
             </w:r>
           </w:p>
         </w:tc>
@@ -1149,56 +1153,53 @@
         <w:rPr>
           <w:b/>
         </w:rPr>
-        <w:t xml:space="preserve">1 of 3 gates met.</w:t>
-      </w:r>
-    </w:p>
-    <w:p>
-      <w:pPr>
+        <w:t xml:space="preserve">They are reasonable conditions for opening a competitive process with a data room. They are not conditions for speaking to anyone.</w:t>
+      </w:r>
+      <w:r>
+        <w:t xml:space="preserve"> Conflating those two is the error.</w:t>
+      </w:r>
+    </w:p>
+    <w:p>
+      <w:pPr>
+        <w:pStyle w:val="Heading3"/>
         <w:spacing w:after="140"/>
       </w:pPr>
       <w:r>
+        <w:t xml:space="preserve">The rule that replaces them</w:t>
+      </w:r>
+    </w:p>
+    <w:p>
+      <w:pPr>
+        <w:spacing w:after="140"/>
+      </w:pPr>
+      <w:r>
         <w:rPr>
           <w:b/>
         </w:rPr>
-        <w:t xml:space="preserve">Stage 1 was supposed to start regardless.</w:t>
-      </w:r>
-      <w:r>
-        <w:t xml:space="preserve"> The plan says warm, exploratory buyer conversations </w:t>
-      </w:r>
-      <w:r>
-        <w:rPr>
-          <w:i/>
-        </w:rPr>
-        <w:t xml:space="preserve">"begin this month"</w:t>
-      </w:r>
-      <w:r>
-        <w:t xml:space="preserve">, written in early August, explicitly </w:t>
-      </w:r>
+        <w:t xml:space="preserve">There is no gate on buyer conversations. None. Start whenever you choose.</w:t>
+      </w:r>
+    </w:p>
+    <w:p>
+      <w:pPr>
+        <w:spacing w:after="140"/>
+      </w:pPr>
+      <w:r>
+        <w:t xml:space="preserve">The only things that stay gated are the confidential core, and those are guardrails, not timing: NDA before specifics, and the answer key and five-condition scoring never leave the building.</w:t>
+      </w:r>
+    </w:p>
+    <w:p>
+      <w:pPr>
+        <w:spacing w:after="140"/>
+      </w:pPr>
       <w:r>
         <w:rPr>
           <w:b/>
         </w:rPr>
-        <w:t xml:space="preserve">not</w:t>
-      </w:r>
-      <w:r>
-        <w:t xml:space="preserve"> gated on publication. </w:t>
-      </w:r>
-      <w:r>
-        <w:rPr>
-          <w:b/>
-        </w:rPr>
-        <w:t xml:space="preserve">Stage 1 has not started.</w:t>
-      </w:r>
-      <w:r>
-        <w:t xml:space="preserve"> That is the single largest execution gap on this page.</w:t>
-      </w:r>
-    </w:p>
-    <w:p>
-      <w:pPr>
-        <w:pBdr>
-          <w:bottom w:val="single" w:sz="6" w:space="1" w:color="AAAAAA"/>
-        </w:pBdr>
-      </w:pPr>
+        <w:t xml:space="preserve">Current position on the old Stage 2 list, kept only for reference:</w:t>
+      </w:r>
+      <w:r>
+        <w:t xml:space="preserve"> publication accepted ✅ (CEP Magazine, 2026-07-16, November issue); marks not filed; no paying pilot.</w:t>
+      </w:r>
     </w:p>
     <w:p>
       <w:pPr>
@@ -2429,7 +2430,10 @@
               <w:rPr>
                 <w:b/>
               </w:rPr>
-              <w:t xml:space="preserve">`[REQUIRES USER INPUT]`</w:t>
+              <w:t xml:space="preserve">ANSWERED 2026-08-13: no, because I advised it was too early.</w:t>
+            </w:r>
+            <w:r>
+              <w:t xml:space="preserve"> Closed</w:t>
             </w:r>
           </w:p>
         </w:tc>
@@ -2457,7 +2461,118 @@
               <w:spacing w:after="0"/>
             </w:pPr>
             <w:r>
-              <w:t xml:space="preserve">Start Stage 1 warm conversations</w:t>
+              <w:t xml:space="preserve">Buyer conversations</w:t>
+            </w:r>
+          </w:p>
+        </w:tc>
+        <w:tc>
+          <w:tcPr>
+            <w:tcW w:w="2340" w:type="dxa"/>
+          </w:tcPr>
+          <w:p>
+            <w:pPr>
+              <w:spacing w:after="0"/>
+            </w:pPr>
+            <w:r>
+              <w:rPr>
+                <w:b/>
+              </w:rPr>
+              <w:t xml:space="preserve">Was blocked by my advice, not by Phillip</w:t>
+            </w:r>
+          </w:p>
+        </w:tc>
+        <w:tc>
+          <w:tcPr>
+            <w:tcW w:w="2340" w:type="dxa"/>
+          </w:tcPr>
+          <w:p>
+            <w:pPr>
+              <w:spacing w:after="0"/>
+            </w:pPr>
+            <w:r>
+              <w:t xml:space="preserve">Gate withdrawn rev 2. No prerequisite remains</w:t>
+            </w:r>
+          </w:p>
+        </w:tc>
+      </w:tr>
+      <w:tr>
+        <w:tc>
+          <w:tcPr>
+            <w:tcW w:w="2340" w:type="dxa"/>
+          </w:tcPr>
+          <w:p>
+            <w:pPr>
+              <w:spacing w:after="0"/>
+            </w:pPr>
+            <w:r>
+              <w:t xml:space="preserve">3</w:t>
+            </w:r>
+          </w:p>
+        </w:tc>
+        <w:tc>
+          <w:tcPr>
+            <w:tcW w:w="2340" w:type="dxa"/>
+          </w:tcPr>
+          <w:p>
+            <w:pPr>
+              <w:spacing w:after="0"/>
+            </w:pPr>
+            <w:r>
+              <w:t xml:space="preserve">Named buyer target list</w:t>
+            </w:r>
+          </w:p>
+        </w:tc>
+        <w:tc>
+          <w:tcPr>
+            <w:tcW w:w="2340" w:type="dxa"/>
+          </w:tcPr>
+          <w:p>
+            <w:pPr>
+              <w:spacing w:after="0"/>
+            </w:pPr>
+            <w:r>
+              <w:t xml:space="preserve">unassigned</w:t>
+            </w:r>
+          </w:p>
+        </w:tc>
+        <w:tc>
+          <w:tcPr>
+            <w:tcW w:w="2340" w:type="dxa"/>
+          </w:tcPr>
+          <w:p>
+            <w:pPr>
+              <w:spacing w:after="0"/>
+            </w:pPr>
+            <w:r>
+              <w:t xml:space="preserve">Does not exist</w:t>
+            </w:r>
+          </w:p>
+        </w:tc>
+      </w:tr>
+      <w:tr>
+        <w:tc>
+          <w:tcPr>
+            <w:tcW w:w="2340" w:type="dxa"/>
+          </w:tcPr>
+          <w:p>
+            <w:pPr>
+              <w:spacing w:after="0"/>
+            </w:pPr>
+            <w:r>
+              <w:t xml:space="preserve">4</w:t>
+            </w:r>
+          </w:p>
+        </w:tc>
+        <w:tc>
+          <w:tcPr>
+            <w:tcW w:w="2340" w:type="dxa"/>
+          </w:tcPr>
+          <w:p>
+            <w:pPr>
+              <w:spacing w:after="0"/>
+            </w:pPr>
+            <w:r>
+              <w:t xml:space="preserve">Marks filed</w:t>
             </w:r>
           </w:p>
         </w:tc>
@@ -2483,127 +2598,16 @@
               <w:spacing w:after="0"/>
             </w:pPr>
             <w:r>
-              <w:rPr>
-                <w:b/>
-              </w:rPr>
-              <w:t xml:space="preserve">Not started.</w:t>
-            </w:r>
-            <w:r>
-              <w:t xml:space="preserve"> Largest gap</w:t>
-            </w:r>
-          </w:p>
-        </w:tc>
-      </w:tr>
-      <w:tr>
-        <w:tc>
-          <w:tcPr>
-            <w:tcW w:w="2340" w:type="dxa"/>
-          </w:tcPr>
-          <w:p>
-            <w:pPr>
-              <w:spacing w:after="0"/>
-            </w:pPr>
-            <w:r>
-              <w:t xml:space="preserve">3</w:t>
-            </w:r>
-          </w:p>
-        </w:tc>
-        <w:tc>
-          <w:tcPr>
-            <w:tcW w:w="2340" w:type="dxa"/>
-          </w:tcPr>
-          <w:p>
-            <w:pPr>
-              <w:spacing w:after="0"/>
-            </w:pPr>
-            <w:r>
-              <w:t xml:space="preserve">Named buyer target list</w:t>
-            </w:r>
-          </w:p>
-        </w:tc>
-        <w:tc>
-          <w:tcPr>
-            <w:tcW w:w="2340" w:type="dxa"/>
-          </w:tcPr>
-          <w:p>
-            <w:pPr>
-              <w:spacing w:after="0"/>
-            </w:pPr>
-            <w:r>
-              <w:t xml:space="preserve">unassigned</w:t>
-            </w:r>
-          </w:p>
-        </w:tc>
-        <w:tc>
-          <w:tcPr>
-            <w:tcW w:w="2340" w:type="dxa"/>
-          </w:tcPr>
-          <w:p>
-            <w:pPr>
-              <w:spacing w:after="0"/>
-            </w:pPr>
-            <w:r>
-              <w:t xml:space="preserve">Does not exist</w:t>
-            </w:r>
-          </w:p>
-        </w:tc>
-      </w:tr>
-      <w:tr>
-        <w:tc>
-          <w:tcPr>
-            <w:tcW w:w="2340" w:type="dxa"/>
-          </w:tcPr>
-          <w:p>
-            <w:pPr>
-              <w:spacing w:after="0"/>
-            </w:pPr>
-            <w:r>
-              <w:t xml:space="preserve">4</w:t>
-            </w:r>
-          </w:p>
-        </w:tc>
-        <w:tc>
-          <w:tcPr>
-            <w:tcW w:w="2340" w:type="dxa"/>
-          </w:tcPr>
-          <w:p>
-            <w:pPr>
-              <w:spacing w:after="0"/>
-            </w:pPr>
-            <w:r>
-              <w:t xml:space="preserve">Marks filed</w:t>
-            </w:r>
-          </w:p>
-        </w:tc>
-        <w:tc>
-          <w:tcPr>
-            <w:tcW w:w="2340" w:type="dxa"/>
-          </w:tcPr>
-          <w:p>
-            <w:pPr>
-              <w:spacing w:after="0"/>
-            </w:pPr>
-            <w:r>
-              <w:t xml:space="preserve">Phillip</w:t>
-            </w:r>
-          </w:p>
-        </w:tc>
-        <w:tc>
-          <w:tcPr>
-            <w:tcW w:w="2340" w:type="dxa"/>
-          </w:tcPr>
-          <w:p>
-            <w:pPr>
-              <w:spacing w:after="0"/>
-            </w:pPr>
-            <w:r>
               <w:t xml:space="preserve">On trigger-rule hold. </w:t>
             </w:r>
             <w:r>
               <w:rPr>
                 <w:b/>
               </w:rPr>
-              <w:t xml:space="preserve">ANDEKS episode is arguably a trigger already fired</w:t>
+              <w:t xml:space="preserve">No longer gates anything.</w:t>
+            </w:r>
+            <w:r>
+              <w:t xml:space="preserve"> ANDEKS episode is arguably a trigger already fired</w:t>
             </w:r>
           </w:p>
         </w:tc>
@@ -2908,6 +2912,62 @@
             </w:pPr>
             <w:r>
               <w:t xml:space="preserve">Change</w:t>
+            </w:r>
+          </w:p>
+        </w:tc>
+      </w:tr>
+      <w:tr>
+        <w:tc>
+          <w:tcPr>
+            <w:tcW w:w="3120" w:type="dxa"/>
+          </w:tcPr>
+          <w:p>
+            <w:pPr>
+              <w:spacing w:after="0"/>
+            </w:pPr>
+            <w:r>
+              <w:t xml:space="preserve">2</w:t>
+            </w:r>
+          </w:p>
+        </w:tc>
+        <w:tc>
+          <w:tcPr>
+            <w:tcW w:w="3120" w:type="dxa"/>
+          </w:tcPr>
+          <w:p>
+            <w:pPr>
+              <w:spacing w:after="0"/>
+            </w:pPr>
+            <w:r>
+              <w:t xml:space="preserve">2026-08-13</w:t>
+            </w:r>
+          </w:p>
+        </w:tc>
+        <w:tc>
+          <w:tcPr>
+            <w:tcW w:w="3120" w:type="dxa"/>
+          </w:tcPr>
+          <w:p>
+            <w:pPr>
+              <w:spacing w:after="0"/>
+            </w:pPr>
+            <w:r>
+              <w:rPr>
+                <w:b/>
+              </w:rPr>
+              <w:t xml:space="preserve">Withdrew the three-gate rule.</w:t>
+            </w:r>
+            <w:r>
+              <w:t xml:space="preserve"> Owner stated he did not approach buyers because I told him it was too early. Verified: </w:t>
+            </w:r>
+            <w:r>
+              <w:rPr>
+                <w:rFonts w:ascii="Consolas" w:hAnsi="Consolas"/>
+              </w:rPr>
+              <w:t xml:space="preserve">Path_to_Sale_Action_Plan.md</w:t>
+            </w:r>
+            <w:r>
+              <w:t xml:space="preserve"> set three prerequisites before buyer outreach, and my 2026-08-13 trademark hold made gate 2 unreachable. Reclassified from owner execution gap to my advice error. No gate now stands between him and a buyer conversation.</w:t>
             </w:r>
           </w:p>
         </w:tc>

</xml_diff>

<commit_message>
IP Sale Tracker rev 3: dossier published as a web section
</commit_message>
<xml_diff>
--- a/research/IP_SALE_TRACKER.docx
+++ b/research/IP_SALE_TRACKER.docx
@@ -20,6 +20,26 @@
           <w:b/>
         </w:rPr>
         <w:t xml:space="preserve">The standing record of the JRS / DRR sale. Revised every turn. This is the file to read first.</w:t>
+      </w:r>
+    </w:p>
+    <w:p>
+      <w:pPr>
+        <w:spacing w:after="140"/>
+      </w:pPr>
+      <w:r>
+        <w:rPr>
+          <w:b/>
+        </w:rPr>
+        <w:t xml:space="preserve">Web version:</w:t>
+      </w:r>
+      <w:r>
+        <w:t xml:space="preserve"> </w:t>
+      </w:r>
+      <w:r>
+        <w:rPr>
+          <w:rFonts w:ascii="Consolas" w:hAnsi="Consolas"/>
+        </w:rPr>
+        <w:t xml:space="preserve">https://jrsstandard.com/programme-status-9872fb93cc94.html#sale-dossier</w:t>
       </w:r>
     </w:p>
     <w:tbl>
@@ -96,7 +116,7 @@
               <w:spacing w:after="0"/>
             </w:pPr>
             <w:r>
-              <w:t xml:space="preserve">2026-08-13 (rev 2)</w:t>
+              <w:t xml:space="preserve">2026-08-13 (rev 3)</w:t>
             </w:r>
           </w:p>
         </w:tc>
@@ -127,7 +147,7 @@
               <w:spacing w:after="0"/>
             </w:pPr>
             <w:r>
-              <w:t xml:space="preserve">2</w:t>
+              <w:t xml:space="preserve">3</w:t>
             </w:r>
           </w:p>
         </w:tc>
@@ -2912,6 +2932,56 @@
             </w:pPr>
             <w:r>
               <w:t xml:space="preserve">Change</w:t>
+            </w:r>
+          </w:p>
+        </w:tc>
+      </w:tr>
+      <w:tr>
+        <w:tc>
+          <w:tcPr>
+            <w:tcW w:w="3120" w:type="dxa"/>
+          </w:tcPr>
+          <w:p>
+            <w:pPr>
+              <w:spacing w:after="0"/>
+            </w:pPr>
+            <w:r>
+              <w:t xml:space="preserve">3</w:t>
+            </w:r>
+          </w:p>
+        </w:tc>
+        <w:tc>
+          <w:tcPr>
+            <w:tcW w:w="3120" w:type="dxa"/>
+          </w:tcPr>
+          <w:p>
+            <w:pPr>
+              <w:spacing w:after="0"/>
+            </w:pPr>
+            <w:r>
+              <w:t xml:space="preserve">2026-08-13</w:t>
+            </w:r>
+          </w:p>
+        </w:tc>
+        <w:tc>
+          <w:tcPr>
+            <w:tcW w:w="3120" w:type="dxa"/>
+          </w:tcPr>
+          <w:p>
+            <w:pPr>
+              <w:spacing w:after="0"/>
+            </w:pPr>
+            <w:r>
+              <w:t xml:space="preserve">Published the dossier as a web section at </w:t>
+            </w:r>
+            <w:r>
+              <w:rPr>
+                <w:rFonts w:ascii="Consolas" w:hAnsi="Consolas"/>
+              </w:rPr>
+              <w:t xml:space="preserve">programme-status-9872fb93cc94.html#sale-dossier</w:t>
+            </w:r>
+            <w:r>
+              <w:t xml:space="preserve">. Placed on the existing private page rather than a new one, per the CLAUDE.md rule that there is one private owner page. Verified live: all seven blocks present, 43 headings, 0 level skips, 0 console errors.</w:t>
             </w:r>
           </w:p>
         </w:tc>

</xml_diff>

<commit_message>
Trackers: country scope pinned; both published figures now computed
</commit_message>
<xml_diff>
--- a/research/IP_SALE_TRACKER.docx
+++ b/research/IP_SALE_TRACKER.docx
@@ -116,7 +116,7 @@
               <w:spacing w:after="0"/>
             </w:pPr>
             <w:r>
-              <w:t xml:space="preserve">2026-08-13 (rev 4)</w:t>
+              <w:t xml:space="preserve">2026-08-13 (rev 5)</w:t>
             </w:r>
           </w:p>
         </w:tc>
@@ -147,7 +147,7 @@
               <w:spacing w:after="0"/>
             </w:pPr>
             <w:r>
-              <w:t xml:space="preserve">4</w:t>
+              <w:t xml:space="preserve">5</w:t>
             </w:r>
           </w:p>
         </w:tc>
@@ -1602,6 +1602,80 @@
           </w:p>
         </w:tc>
       </w:tr>
+      <w:tr>
+        <w:tc>
+          <w:tcPr>
+            <w:tcW w:w="4680" w:type="dxa"/>
+          </w:tcPr>
+          <w:p>
+            <w:pPr>
+              <w:spacing w:after="0"/>
+            </w:pPr>
+            <w:r>
+              <w:t xml:space="preserve">Detection panel alone</w:t>
+            </w:r>
+          </w:p>
+        </w:tc>
+        <w:tc>
+          <w:tcPr>
+            <w:tcW w:w="4680" w:type="dxa"/>
+          </w:tcPr>
+          <w:p>
+            <w:pPr>
+              <w:spacing w:after="0"/>
+            </w:pPr>
+            <w:r>
+              <w:rPr>
+                <w:b/>
+              </w:rPr>
+              <w:t xml:space="preserve">16 completers, 11 countries</w:t>
+            </w:r>
+            <w:r>
+              <w:t xml:space="preserve"> (the figure the manuscript publishes)</w:t>
+            </w:r>
+          </w:p>
+        </w:tc>
+      </w:tr>
+      <w:tr>
+        <w:tc>
+          <w:tcPr>
+            <w:tcW w:w="4680" w:type="dxa"/>
+          </w:tcPr>
+          <w:p>
+            <w:pPr>
+              <w:spacing w:after="0"/>
+            </w:pPr>
+            <w:r>
+              <w:t xml:space="preserve">Everyone who graded at least one record</w:t>
+            </w:r>
+          </w:p>
+        </w:tc>
+        <w:tc>
+          <w:tcPr>
+            <w:tcW w:w="4680" w:type="dxa"/>
+          </w:tcPr>
+          <w:p>
+            <w:pPr>
+              <w:spacing w:after="0"/>
+            </w:pPr>
+            <w:r>
+              <w:rPr>
+                <w:b/>
+              </w:rPr>
+              <w:t xml:space="preserve">57 reviewers.</w:t>
+            </w:r>
+            <w:r>
+              <w:t xml:space="preserve"> </w:t>
+            </w:r>
+            <w:r>
+              <w:rPr>
+                <w:b/>
+              </w:rPr>
+              <w:t xml:space="preserve">The 16-country figure does NOT belong to this number</w:t>
+            </w:r>
+          </w:p>
+        </w:tc>
+      </w:tr>
     </w:tbl>
     <w:p>
       <w:pPr/>
@@ -1618,6 +1692,83 @@
           <w:b/>
         </w:rPr>
         <w:t xml:space="preserve">The 36-reviewer panel is the asset. Everything else on this table is small.</w:t>
+      </w:r>
+    </w:p>
+    <w:p>
+      <w:pPr>
+        <w:spacing w:after="140"/>
+      </w:pPr>
+      <w:r>
+        <w:rPr>
+          <w:b/>
+        </w:rPr>
+        <w:t xml:space="preserve">COUNTRY SCOPE RULE, binding on every buyer-facing claim:</w:t>
+      </w:r>
+      <w:r>
+        <w:t xml:space="preserve"> 16 countries belongs to the </w:t>
+      </w:r>
+      <w:r>
+        <w:rPr>
+          <w:b/>
+        </w:rPr>
+        <w:t xml:space="preserve">36 full-set completers</w:t>
+      </w:r>
+      <w:r>
+        <w:t xml:space="preserve">. 11 belongs to the </w:t>
+      </w:r>
+      <w:r>
+        <w:rPr>
+          <w:b/>
+        </w:rPr>
+        <w:t xml:space="preserve">detection panel alone</w:t>
+      </w:r>
+      <w:r>
+        <w:t xml:space="preserve">. Neither belongs to the 57 reviewers. Attaching the country figure to the reviewer total is a </w:t>
+      </w:r>
+      <w:r>
+        <w:rPr>
+          <w:b/>
+        </w:rPr>
+        <w:t xml:space="preserve">recorded past defect</w:t>
+      </w:r>
+      <w:r>
+        <w:t xml:space="preserve"> in </w:t>
+      </w:r>
+      <w:r>
+        <w:rPr>
+          <w:rFonts w:ascii="Consolas" w:hAnsi="Consolas"/>
+        </w:rPr>
+        <w:t xml:space="preserve">research/MASTER_TRACKER.md</w:t>
+      </w:r>
+      <w:r>
+        <w:t xml:space="preserve">, and both figures are now computed live by </w:t>
+      </w:r>
+      <w:r>
+        <w:rPr>
+          <w:rFonts w:ascii="Consolas" w:hAnsi="Consolas"/>
+        </w:rPr>
+        <w:t xml:space="preserve">/api/panel-stats</w:t>
+      </w:r>
+      <w:r>
+        <w:t xml:space="preserve"> as </w:t>
+      </w:r>
+      <w:r>
+        <w:rPr>
+          <w:rFonts w:ascii="Consolas" w:hAnsi="Consolas"/>
+        </w:rPr>
+        <w:t xml:space="preserve">countries</w:t>
+      </w:r>
+      <w:r>
+        <w:t xml:space="preserve"> and </w:t>
+      </w:r>
+      <w:r>
+        <w:rPr>
+          <w:rFonts w:ascii="Consolas" w:hAnsi="Consolas"/>
+        </w:rPr>
+        <w:t xml:space="preserve">detection_countries</w:t>
+      </w:r>
+      <w:r>
+        <w:t xml:space="preserve"> so neither can be transcribed wrongly again.</w:t>
       </w:r>
     </w:p>
     <w:p>
@@ -2959,6 +3110,56 @@
             </w:pPr>
             <w:r>
               <w:t xml:space="preserve">Change</w:t>
+            </w:r>
+          </w:p>
+        </w:tc>
+      </w:tr>
+      <w:tr>
+        <w:tc>
+          <w:tcPr>
+            <w:tcW w:w="3120" w:type="dxa"/>
+          </w:tcPr>
+          <w:p>
+            <w:pPr>
+              <w:spacing w:after="0"/>
+            </w:pPr>
+            <w:r>
+              <w:t xml:space="preserve">5</w:t>
+            </w:r>
+          </w:p>
+        </w:tc>
+        <w:tc>
+          <w:tcPr>
+            <w:tcW w:w="3120" w:type="dxa"/>
+          </w:tcPr>
+          <w:p>
+            <w:pPr>
+              <w:spacing w:after="0"/>
+            </w:pPr>
+            <w:r>
+              <w:t xml:space="preserve">2026-08-13</w:t>
+            </w:r>
+          </w:p>
+        </w:tc>
+        <w:tc>
+          <w:tcPr>
+            <w:tcW w:w="3120" w:type="dxa"/>
+          </w:tcPr>
+          <w:p>
+            <w:pPr>
+              <w:spacing w:after="0"/>
+            </w:pPr>
+            <w:r>
+              <w:t xml:space="preserve">Country scope pinned. Both published figures, 16 for all completers and 11 for the detection panel, are now computed from one map by </w:t>
+            </w:r>
+            <w:r>
+              <w:rPr>
+                <w:rFonts w:ascii="Consolas" w:hAnsi="Consolas"/>
+              </w:rPr>
+              <w:t xml:space="preserve">/api/panel-stats</w:t>
+            </w:r>
+            <w:r>
+              <w:t xml:space="preserve">, and the dashboard card carries its own scope. Checked all three studies: 004's 24 reliability raters count toward the 57 reviewers but add no country, their recorded countries being India, US and Australia, all already inside the 16.</w:t>
             </w:r>
           </w:p>
         </w:tc>

</xml_diff>

<commit_message>
Consent and release audit; IP Sale Tracker rev 6
</commit_message>
<xml_diff>
--- a/research/IP_SALE_TRACKER.docx
+++ b/research/IP_SALE_TRACKER.docx
@@ -116,7 +116,7 @@
               <w:spacing w:after="0"/>
             </w:pPr>
             <w:r>
-              <w:t xml:space="preserve">2026-08-13 (rev 5)</w:t>
+              <w:t xml:space="preserve">2026-08-13 (rev 6)</w:t>
             </w:r>
           </w:p>
         </w:tc>
@@ -147,7 +147,7 @@
               <w:spacing w:after="0"/>
             </w:pPr>
             <w:r>
-              <w:t xml:space="preserve">5</w:t>
+              <w:t xml:space="preserve">6</w:t>
             </w:r>
           </w:p>
         </w:tc>
@@ -3110,6 +3110,74 @@
             </w:pPr>
             <w:r>
               <w:t xml:space="preserve">Change</w:t>
+            </w:r>
+          </w:p>
+        </w:tc>
+      </w:tr>
+      <w:tr>
+        <w:tc>
+          <w:tcPr>
+            <w:tcW w:w="3120" w:type="dxa"/>
+          </w:tcPr>
+          <w:p>
+            <w:pPr>
+              <w:spacing w:after="0"/>
+            </w:pPr>
+            <w:r>
+              <w:t xml:space="preserve">6</w:t>
+            </w:r>
+          </w:p>
+        </w:tc>
+        <w:tc>
+          <w:tcPr>
+            <w:tcW w:w="3120" w:type="dxa"/>
+          </w:tcPr>
+          <w:p>
+            <w:pPr>
+              <w:spacing w:after="0"/>
+            </w:pPr>
+            <w:r>
+              <w:t xml:space="preserve">2026-08-13</w:t>
+            </w:r>
+          </w:p>
+        </w:tc>
+        <w:tc>
+          <w:tcPr>
+            <w:tcW w:w="3120" w:type="dxa"/>
+          </w:tcPr>
+          <w:p>
+            <w:pPr>
+              <w:spacing w:after="0"/>
+            </w:pPr>
+            <w:r>
+              <w:t xml:space="preserve">Consent and release audit completed, </w:t>
+            </w:r>
+            <w:r>
+              <w:rPr>
+                <w:rFonts w:ascii="Consolas" w:hAnsi="Consolas"/>
+              </w:rPr>
+              <w:t xml:space="preserve">research/CONSENT_AND_RELEASE_AUDIT_2026-08-13.md</w:t>
+            </w:r>
+            <w:r>
+              <w:t xml:space="preserve">. </w:t>
+            </w:r>
+            <w:r>
+              <w:rPr>
+                <w:b/>
+              </w:rPr>
+              <w:t xml:space="preserve">Nothing is signed anywhere; every permission is a tick plus a stored boolean.</w:t>
+            </w:r>
+            <w:r>
+              <w:t xml:space="preserve"> Seven real protections identified, led by no-record-text-ever-stored and the answers/identity table split. </w:t>
+            </w:r>
+            <w:r>
+              <w:rPr>
+                <w:b/>
+              </w:rPr>
+              <w:t xml:space="preserve">Four gaps, two of which cost money at sale: no copyright assignment from co-authors (consent is not assignment), and the contributor confirmation instrument that captures continuing-use and transfer rights has been sent to 0 of 20.</w:t>
+            </w:r>
+            <w:r>
+              <w:t xml:space="preserve"> No terms version is stored against any consent row, so the wording a person saw cannot be proven.</w:t>
             </w:r>
           </w:p>
         </w:tc>

</xml_diff>

<commit_message>
Regenerate IP_SALE_TRACKER.docx for rev 7
Co-Authored-By: Claude Opus 5 <noreply@anthropic.com>
Claude-Session: https://claude.ai/code/session_01W9UtE7X76spacWeSvBH7tv
</commit_message>
<xml_diff>
--- a/research/IP_SALE_TRACKER.docx
+++ b/research/IP_SALE_TRACKER.docx
@@ -116,7 +116,7 @@
               <w:spacing w:after="0"/>
             </w:pPr>
             <w:r>
-              <w:t xml:space="preserve">2026-08-13 (rev 6)</w:t>
+              <w:t xml:space="preserve">2026-08-13 (rev 7)</w:t>
             </w:r>
           </w:p>
         </w:tc>
@@ -147,7 +147,7 @@
               <w:spacing w:after="0"/>
             </w:pPr>
             <w:r>
-              <w:t xml:space="preserve">6</w:t>
+              <w:t xml:space="preserve">7</w:t>
             </w:r>
           </w:p>
         </w:tc>
@@ -2367,6 +2367,475 @@
       </w:r>
       <w:r>
         <w:t xml:space="preserve"> or a research task.</w:t>
+      </w:r>
+    </w:p>
+    <w:p>
+      <w:pPr>
+        <w:pBdr>
+          <w:bottom w:val="single" w:sz="6" w:space="1" w:color="AAAAAA"/>
+        </w:pBdr>
+      </w:pPr>
+    </w:p>
+    <w:p>
+      <w:pPr>
+        <w:pStyle w:val="Heading2"/>
+        <w:spacing w:after="140"/>
+      </w:pPr>
+      <w:r>
+        <w:t xml:space="preserve">7b. COMMERCIAL PACKAGING: what to sell before the whole asset sells (rev 7)</w:t>
+      </w:r>
+    </w:p>
+    <w:p>
+      <w:pPr>
+        <w:spacing w:after="140"/>
+      </w:pPr>
+      <w:r>
+        <w:rPr>
+          <w:rFonts w:ascii="Consolas" w:hAnsi="Consolas"/>
+        </w:rPr>
+        <w:t xml:space="preserve">IP_COMMERCIALIZATION_AUDIT.md</w:t>
+      </w:r>
+      <w:r>
+        <w:t xml:space="preserve"> (repo root, 2026-08-13) audited every local file for saleable IP. </w:t>
+      </w:r>
+      <w:r>
+        <w:rPr>
+          <w:b/>
+        </w:rPr>
+        <w:t xml:space="preserve">The disconnect it found: the public site sells participation, and the two assets an enterprise buyer would actually pay for are not on it at all.</w:t>
+      </w:r>
+    </w:p>
+    <w:tbl>
+      <w:tblPr>
+        <w:tblStyle w:val="TableGrid"/>
+        <w:tblW w:w="9360" w:type="dxa"/>
+        <w:tblBorders>
+          <w:top w:val="single" w:sz="4" w:space="0" w:color="999999"/>
+          <w:left w:val="single" w:sz="4" w:space="0" w:color="999999"/>
+          <w:bottom w:val="single" w:sz="4" w:space="0" w:color="999999"/>
+          <w:right w:val="single" w:sz="4" w:space="0" w:color="999999"/>
+          <w:insideH w:val="single" w:sz="4" w:space="0" w:color="999999"/>
+          <w:insideV w:val="single" w:sz="4" w:space="0" w:color="999999"/>
+        </w:tblBorders>
+      </w:tblPr>
+      <w:tblGrid>
+        <w:gridCol w:w="1560"/>
+        <w:gridCol w:w="1560"/>
+        <w:gridCol w:w="1560"/>
+        <w:gridCol w:w="1560"/>
+        <w:gridCol w:w="1560"/>
+        <w:gridCol w:w="1560"/>
+      </w:tblGrid>
+      <w:tr>
+        <w:tc>
+          <w:tcPr>
+            <w:tcW w:w="1560" w:type="dxa"/>
+          </w:tcPr>
+          <w:p>
+            <w:pPr>
+              <w:spacing w:after="0"/>
+            </w:pPr>
+            <w:r>
+              <w:t xml:space="preserve">Rank</w:t>
+            </w:r>
+          </w:p>
+        </w:tc>
+        <w:tc>
+          <w:tcPr>
+            <w:tcW w:w="1560" w:type="dxa"/>
+          </w:tcPr>
+          <w:p>
+            <w:pPr>
+              <w:spacing w:after="0"/>
+            </w:pPr>
+            <w:r>
+              <w:t xml:space="preserve">Package</w:t>
+            </w:r>
+          </w:p>
+        </w:tc>
+        <w:tc>
+          <w:tcPr>
+            <w:tcW w:w="1560" w:type="dxa"/>
+          </w:tcPr>
+          <w:p>
+            <w:pPr>
+              <w:spacing w:after="0"/>
+            </w:pPr>
+            <w:r>
+              <w:t xml:space="preserve">Source asset</w:t>
+            </w:r>
+          </w:p>
+        </w:tc>
+        <w:tc>
+          <w:tcPr>
+            <w:tcW w:w="1560" w:type="dxa"/>
+          </w:tcPr>
+          <w:p>
+            <w:pPr>
+              <w:spacing w:after="0"/>
+            </w:pPr>
+            <w:r>
+              <w:t xml:space="preserve">Public pages today</w:t>
+            </w:r>
+          </w:p>
+        </w:tc>
+        <w:tc>
+          <w:tcPr>
+            <w:tcW w:w="1560" w:type="dxa"/>
+          </w:tcPr>
+          <w:p>
+            <w:pPr>
+              <w:spacing w:after="0"/>
+            </w:pPr>
+            <w:r>
+              <w:t xml:space="preserve">Persona</w:t>
+            </w:r>
+          </w:p>
+        </w:tc>
+        <w:tc>
+          <w:tcPr>
+            <w:tcW w:w="1560" w:type="dxa"/>
+          </w:tcPr>
+          <w:p>
+            <w:pPr>
+              <w:spacing w:after="0"/>
+            </w:pPr>
+            <w:r>
+              <w:t xml:space="preserve">Speed</w:t>
+            </w:r>
+          </w:p>
+        </w:tc>
+      </w:tr>
+      <w:tr>
+        <w:tc>
+          <w:tcPr>
+            <w:tcW w:w="1560" w:type="dxa"/>
+          </w:tcPr>
+          <w:p>
+            <w:pPr>
+              <w:spacing w:after="0"/>
+            </w:pPr>
+            <w:r>
+              <w:rPr>
+                <w:b/>
+              </w:rPr>
+              <w:t xml:space="preserve">1</w:t>
+            </w:r>
+          </w:p>
+        </w:tc>
+        <w:tc>
+          <w:tcPr>
+            <w:tcW w:w="1560" w:type="dxa"/>
+          </w:tcPr>
+          <w:p>
+            <w:pPr>
+              <w:spacing w:after="0"/>
+            </w:pPr>
+            <w:r>
+              <w:rPr>
+                <w:b/>
+              </w:rPr>
+              <w:t xml:space="preserve">Seven-Point Record Defensibility Check</w:t>
+            </w:r>
+          </w:p>
+        </w:tc>
+        <w:tc>
+          <w:tcPr>
+            <w:tcW w:w="1560" w:type="dxa"/>
+          </w:tcPr>
+          <w:p>
+            <w:pPr>
+              <w:spacing w:after="0"/>
+            </w:pPr>
+            <w:r>
+              <w:t xml:space="preserve">Seven named AI failure modes, </w:t>
+            </w:r>
+            <w:r>
+              <w:rPr>
+                <w:rFonts w:ascii="Consolas" w:hAnsi="Consolas"/>
+              </w:rPr>
+              <w:t xml:space="preserve">research/JRS_Validation_Report.md</w:t>
+            </w:r>
+            <w:r>
+              <w:t xml:space="preserve"> s4</w:t>
+            </w:r>
+          </w:p>
+        </w:tc>
+        <w:tc>
+          <w:tcPr>
+            <w:tcW w:w="1560" w:type="dxa"/>
+          </w:tcPr>
+          <w:p>
+            <w:pPr>
+              <w:spacing w:after="0"/>
+            </w:pPr>
+            <w:r>
+              <w:rPr>
+                <w:b/>
+              </w:rPr>
+              <w:t xml:space="preserve">0 of 45</w:t>
+            </w:r>
+          </w:p>
+        </w:tc>
+        <w:tc>
+          <w:tcPr>
+            <w:tcW w:w="1560" w:type="dxa"/>
+          </w:tcPr>
+          <w:p>
+            <w:pPr>
+              <w:spacing w:after="0"/>
+            </w:pPr>
+            <w:r>
+              <w:t xml:space="preserve">General Counsel, Head of ER / Investigations</w:t>
+            </w:r>
+          </w:p>
+        </w:tc>
+        <w:tc>
+          <w:tcPr>
+            <w:tcW w:w="1560" w:type="dxa"/>
+          </w:tcPr>
+          <w:p>
+            <w:pPr>
+              <w:spacing w:after="0"/>
+            </w:pPr>
+            <w:r>
+              <w:rPr>
+                <w:b/>
+              </w:rPr>
+              <w:t xml:space="preserve">Days</w:t>
+            </w:r>
+          </w:p>
+        </w:tc>
+      </w:tr>
+      <w:tr>
+        <w:tc>
+          <w:tcPr>
+            <w:tcW w:w="1560" w:type="dxa"/>
+          </w:tcPr>
+          <w:p>
+            <w:pPr>
+              <w:spacing w:after="0"/>
+            </w:pPr>
+            <w:r>
+              <w:rPr>
+                <w:b/>
+              </w:rPr>
+              <w:t xml:space="preserve">2</w:t>
+            </w:r>
+          </w:p>
+        </w:tc>
+        <w:tc>
+          <w:tcPr>
+            <w:tcW w:w="1560" w:type="dxa"/>
+          </w:tcPr>
+          <w:p>
+            <w:pPr>
+              <w:spacing w:after="0"/>
+            </w:pPr>
+            <w:r>
+              <w:rPr>
+                <w:b/>
+              </w:rPr>
+              <w:t xml:space="preserve">Model-Agreement Evidence Pack</w:t>
+            </w:r>
+          </w:p>
+        </w:tc>
+        <w:tc>
+          <w:tcPr>
+            <w:tcW w:w="1560" w:type="dxa"/>
+          </w:tcPr>
+          <w:p>
+            <w:pPr>
+              <w:spacing w:after="0"/>
+            </w:pPr>
+            <w:r>
+              <w:t xml:space="preserve">Cross-vendor nightly harness, </w:t>
+            </w:r>
+            <w:r>
+              <w:rPr>
+                <w:rFonts w:ascii="Consolas" w:hAnsi="Consolas"/>
+              </w:rPr>
+              <w:t xml:space="preserve">api/run-study.js</w:t>
+            </w:r>
+            <w:r>
+              <w:t xml:space="preserve">, 86.7% agreement over 37 runs</w:t>
+            </w:r>
+          </w:p>
+        </w:tc>
+        <w:tc>
+          <w:tcPr>
+            <w:tcW w:w="1560" w:type="dxa"/>
+          </w:tcPr>
+          <w:p>
+            <w:pPr>
+              <w:spacing w:after="0"/>
+            </w:pPr>
+            <w:r>
+              <w:rPr>
+                <w:b/>
+              </w:rPr>
+              <w:t xml:space="preserve">0 of 45</w:t>
+            </w:r>
+          </w:p>
+        </w:tc>
+        <w:tc>
+          <w:tcPr>
+            <w:tcW w:w="1560" w:type="dxa"/>
+          </w:tcPr>
+          <w:p>
+            <w:pPr>
+              <w:spacing w:after="0"/>
+            </w:pPr>
+            <w:r>
+              <w:t xml:space="preserve">Chief AI Officer, Model Risk</w:t>
+            </w:r>
+          </w:p>
+        </w:tc>
+        <w:tc>
+          <w:tcPr>
+            <w:tcW w:w="1560" w:type="dxa"/>
+          </w:tcPr>
+          <w:p>
+            <w:pPr>
+              <w:spacing w:after="0"/>
+            </w:pPr>
+            <w:r>
+              <w:t xml:space="preserve">Weeks</w:t>
+            </w:r>
+          </w:p>
+        </w:tc>
+      </w:tr>
+      <w:tr>
+        <w:tc>
+          <w:tcPr>
+            <w:tcW w:w="1560" w:type="dxa"/>
+          </w:tcPr>
+          <w:p>
+            <w:pPr>
+              <w:spacing w:after="0"/>
+            </w:pPr>
+            <w:r>
+              <w:rPr>
+                <w:b/>
+              </w:rPr>
+              <w:t xml:space="preserve">3</w:t>
+            </w:r>
+          </w:p>
+        </w:tc>
+        <w:tc>
+          <w:tcPr>
+            <w:tcW w:w="1560" w:type="dxa"/>
+          </w:tcPr>
+          <w:p>
+            <w:pPr>
+              <w:spacing w:after="0"/>
+            </w:pPr>
+            <w:r>
+              <w:rPr>
+                <w:b/>
+              </w:rPr>
+              <w:t xml:space="preserve">Benchmark Access and Calibration</w:t>
+            </w:r>
+          </w:p>
+        </w:tc>
+        <w:tc>
+          <w:tcPr>
+            <w:tcW w:w="1560" w:type="dxa"/>
+          </w:tcPr>
+          <w:p>
+            <w:pPr>
+              <w:spacing w:after="0"/>
+            </w:pPr>
+            <w:r>
+              <w:t xml:space="preserve">24-record set + held-out key, </w:t>
+            </w:r>
+            <w:r>
+              <w:rPr>
+                <w:rFonts w:ascii="Consolas" w:hAnsi="Consolas"/>
+              </w:rPr>
+              <w:t xml:space="preserve">api/bench-admin.js</w:t>
+            </w:r>
+          </w:p>
+        </w:tc>
+        <w:tc>
+          <w:tcPr>
+            <w:tcW w:w="1560" w:type="dxa"/>
+          </w:tcPr>
+          <w:p>
+            <w:pPr>
+              <w:spacing w:after="0"/>
+            </w:pPr>
+            <w:r>
+              <w:t xml:space="preserve">Named, never offered</w:t>
+            </w:r>
+          </w:p>
+        </w:tc>
+        <w:tc>
+          <w:tcPr>
+            <w:tcW w:w="1560" w:type="dxa"/>
+          </w:tcPr>
+          <w:p>
+            <w:pPr>
+              <w:spacing w:after="0"/>
+            </w:pPr>
+            <w:r>
+              <w:t xml:space="preserve">AI assurance vendors, audit firms</w:t>
+            </w:r>
+          </w:p>
+        </w:tc>
+        <w:tc>
+          <w:tcPr>
+            <w:tcW w:w="1560" w:type="dxa"/>
+          </w:tcPr>
+          <w:p>
+            <w:pPr>
+              <w:spacing w:after="0"/>
+            </w:pPr>
+            <w:r>
+              <w:t xml:space="preserve">Months. </w:t>
+            </w:r>
+            <w:r>
+              <w:rPr>
+                <w:b/>
+              </w:rPr>
+              <w:t xml:space="preserve">Highest ceiling</w:t>
+            </w:r>
+          </w:p>
+        </w:tc>
+      </w:tr>
+    </w:tbl>
+    <w:p>
+      <w:pPr/>
+      <w:r>
+        <w:t/>
+      </w:r>
+    </w:p>
+    <w:p>
+      <w:pPr>
+        <w:spacing w:after="140"/>
+      </w:pPr>
+      <w:r>
+        <w:rPr>
+          <w:b/>
+        </w:rPr>
+        <w:t xml:space="preserve">Why this belongs in the sale record.</w:t>
+      </w:r>
+      <w:r>
+        <w:t xml:space="preserve"> Rank 3 is the only one that touches the guardrails: the answer key stays with the holder and scoring is returned by the holder, which is what makes the benchmark licensable more than once rather than sold once. Ranks 1 and 2 are demand tests, not asset disposals: they cost nothing to run and they produce the buyer conversations this tracker has recorded zero of.</w:t>
+      </w:r>
+    </w:p>
+    <w:p>
+      <w:pPr>
+        <w:spacing w:after="140"/>
+      </w:pPr>
+      <w:r>
+        <w:rPr>
+          <w:b/>
+        </w:rPr>
+        <w:t xml:space="preserve">Constraint that still blocks all three: there is no payment mechanism anywhere on the site.</w:t>
+      </w:r>
+      <w:r>
+        <w:t xml:space="preserve"> Open item 6, unchanged.</w:t>
       </w:r>
     </w:p>
     <w:p>
@@ -3110,6 +3579,71 @@
             </w:pPr>
             <w:r>
               <w:t xml:space="preserve">Change</w:t>
+            </w:r>
+          </w:p>
+        </w:tc>
+      </w:tr>
+      <w:tr>
+        <w:tc>
+          <w:tcPr>
+            <w:tcW w:w="3120" w:type="dxa"/>
+          </w:tcPr>
+          <w:p>
+            <w:pPr>
+              <w:spacing w:after="0"/>
+            </w:pPr>
+            <w:r>
+              <w:t xml:space="preserve">7</w:t>
+            </w:r>
+          </w:p>
+        </w:tc>
+        <w:tc>
+          <w:tcPr>
+            <w:tcW w:w="3120" w:type="dxa"/>
+          </w:tcPr>
+          <w:p>
+            <w:pPr>
+              <w:spacing w:after="0"/>
+            </w:pPr>
+            <w:r>
+              <w:t xml:space="preserve">2026-08-13</w:t>
+            </w:r>
+          </w:p>
+        </w:tc>
+        <w:tc>
+          <w:tcPr>
+            <w:tcW w:w="3120" w:type="dxa"/>
+          </w:tcPr>
+          <w:p>
+            <w:pPr>
+              <w:spacing w:after="0"/>
+            </w:pPr>
+            <w:r>
+              <w:rPr>
+                <w:b/>
+              </w:rPr>
+              <w:t xml:space="preserve">Commercial packaging audit</w:t>
+            </w:r>
+            <w:r>
+              <w:t xml:space="preserve">, </w:t>
+            </w:r>
+            <w:r>
+              <w:rPr>
+                <w:rFonts w:ascii="Consolas" w:hAnsi="Consolas"/>
+              </w:rPr>
+              <w:t xml:space="preserve">IP_COMMERCIALIZATION_AUDIT.md</w:t>
+            </w:r>
+            <w:r>
+              <w:t xml:space="preserve">. Grep across 45 public HTML files and 36 API endpoints found the two highest-value assets carry </w:t>
+            </w:r>
+            <w:r>
+              <w:rPr>
+                <w:b/>
+              </w:rPr>
+              <w:t xml:space="preserve">zero public surface</w:t>
+            </w:r>
+            <w:r>
+              <w:t xml:space="preserve">: the seven named AI failure modes and the cross-vendor reproducibility harness. Three packages ranked by demand and speed to market, new Section 7b. Rank 1 is buildable in days and is the first offer in the programme that delivers value before asking for anything. Live figures re-read, not carried: 36 completers, 16 countries, 1 evaluation open, 0 submissions, 0 org pilots, $0 revenue.</w:t>
             </w:r>
           </w:p>
         </w:tc>

</xml_diff>

<commit_message>
Regenerate IP_SALE_TRACKER.docx for rev 8
Co-Authored-By: Claude Opus 5 <noreply@anthropic.com>
Claude-Session: https://claude.ai/code/session_01W9UtE7X76spacWeSvBH7tv
</commit_message>
<xml_diff>
--- a/research/IP_SALE_TRACKER.docx
+++ b/research/IP_SALE_TRACKER.docx
@@ -116,7 +116,7 @@
               <w:spacing w:after="0"/>
             </w:pPr>
             <w:r>
-              <w:t xml:space="preserve">2026-08-13 (rev 7)</w:t>
+              <w:t xml:space="preserve">2026-08-13 (rev 8)</w:t>
             </w:r>
           </w:p>
         </w:tc>
@@ -147,7 +147,7 @@
               <w:spacing w:after="0"/>
             </w:pPr>
             <w:r>
-              <w:t xml:space="preserve">7</w:t>
+              <w:t xml:space="preserve">8</w:t>
             </w:r>
           </w:p>
         </w:tc>
@@ -3579,6 +3579,53 @@
             </w:pPr>
             <w:r>
               <w:t xml:space="preserve">Change</w:t>
+            </w:r>
+          </w:p>
+        </w:tc>
+      </w:tr>
+      <w:tr>
+        <w:tc>
+          <w:tcPr>
+            <w:tcW w:w="3120" w:type="dxa"/>
+          </w:tcPr>
+          <w:p>
+            <w:pPr>
+              <w:spacing w:after="0"/>
+            </w:pPr>
+            <w:r>
+              <w:t xml:space="preserve">8</w:t>
+            </w:r>
+          </w:p>
+        </w:tc>
+        <w:tc>
+          <w:tcPr>
+            <w:tcW w:w="3120" w:type="dxa"/>
+          </w:tcPr>
+          <w:p>
+            <w:pPr>
+              <w:spacing w:after="0"/>
+            </w:pPr>
+            <w:r>
+              <w:t xml:space="preserve">2026-08-13</w:t>
+            </w:r>
+          </w:p>
+        </w:tc>
+        <w:tc>
+          <w:tcPr>
+            <w:tcW w:w="3120" w:type="dxa"/>
+          </w:tcPr>
+          <w:p>
+            <w:pPr>
+              <w:spacing w:after="0"/>
+            </w:pPr>
+            <w:r>
+              <w:t xml:space="preserve">Link-click telemetry surfaced on the owner dashboard. Bears on the sale only as diligence hygiene: the asset now demonstrates a closed measurement loop from click to panel, with every figure computed at request time and none stored. First live read attributed the sole evaluation open to India. </w:t>
+            </w:r>
+            <w:r>
+              <w:rPr>
+                <w:b/>
+              </w:rPr>
+              <w:t xml:space="preserve">No change to the packaging in Section 7b, to the guardrails, or to any open item.</w:t>
             </w:r>
           </w:p>
         </w:tc>

</xml_diff>

<commit_message>
Trackers: record the two corrections (IP sale tracker rev 10)
Co-Authored-By: Claude Opus 5 <noreply@anthropic.com>
Claude-Session: https://claude.ai/code/session_01W9UtE7X76spacWeSvBH7tv
</commit_message>
<xml_diff>
--- a/research/IP_SALE_TRACKER.docx
+++ b/research/IP_SALE_TRACKER.docx
@@ -355,7 +355,7 @@
               <w:spacing w:after="0"/>
             </w:pPr>
             <w:r>
-              <w:t xml:space="preserve">2026-08-13 (rev 9)</w:t>
+              <w:t xml:space="preserve">2026-08-14 (rev 10)</w:t>
             </w:r>
           </w:p>
         </w:tc>
@@ -386,7 +386,7 @@
               <w:spacing w:after="0"/>
             </w:pPr>
             <w:r>
-              <w:t xml:space="preserve">9</w:t>
+              <w:t xml:space="preserve">10</w:t>
             </w:r>
           </w:p>
         </w:tc>
@@ -3827,6 +3827,113 @@
             </w:pPr>
             <w:r>
               <w:t xml:space="preserve">Change</w:t>
+            </w:r>
+          </w:p>
+        </w:tc>
+      </w:tr>
+      <w:tr>
+        <w:tc>
+          <w:tcPr>
+            <w:tcW w:w="3120" w:type="dxa"/>
+          </w:tcPr>
+          <w:p>
+            <w:pPr>
+              <w:spacing w:after="0"/>
+            </w:pPr>
+            <w:r>
+              <w:t xml:space="preserve">10</w:t>
+            </w:r>
+          </w:p>
+        </w:tc>
+        <w:tc>
+          <w:tcPr>
+            <w:tcW w:w="3120" w:type="dxa"/>
+          </w:tcPr>
+          <w:p>
+            <w:pPr>
+              <w:spacing w:after="0"/>
+            </w:pPr>
+            <w:r>
+              <w:t xml:space="preserve">2026-08-14</w:t>
+            </w:r>
+          </w:p>
+        </w:tc>
+        <w:tc>
+          <w:tcPr>
+            <w:tcW w:w="3120" w:type="dxa"/>
+          </w:tcPr>
+          <w:p>
+            <w:pPr>
+              <w:spacing w:after="0"/>
+            </w:pPr>
+            <w:r>
+              <w:rPr>
+                <w:b/>
+              </w:rPr>
+              <w:t xml:space="preserve">Two of my own fabrications corrected, both bearing on the evaluator outreach that carries the paid tiers to 36 people.</w:t>
+            </w:r>
+            <w:r>
+              <w:t xml:space="preserve"> (1) I invented "the owner closed the study on 2026-08-14" from an angry aside and wrote it into five files as fact. </w:t>
+            </w:r>
+            <w:r>
+              <w:rPr>
+                <w:b/>
+              </w:rPr>
+              <w:t xml:space="preserve">The comparison study is OPEN and closes 2026-08-15.</w:t>
+            </w:r>
+            <w:r>
+              <w:t xml:space="preserve"> Purged everywhere. Arm B remains on the contributor roster on the owner's explicit instruction, which stands without a closure date behind it. (2) I conflated the send date with the due date: </w:t>
+            </w:r>
+            <w:r>
+              <w:rPr>
+                <w:b/>
+              </w:rPr>
+              <w:t xml:space="preserve">15 August is when the messages go out, 31 August 2026 is when a response is due.</w:t>
+            </w:r>
+            <w:r>
+              <w:t xml:space="preserve"> </w:t>
+            </w:r>
+            <w:r>
+              <w:rPr>
+                <w:rFonts w:ascii="Consolas" w:hAnsi="Consolas"/>
+              </w:rPr>
+              <w:t xml:space="preserve">FALLBACK_DATE</w:t>
+            </w:r>
+            <w:r>
+              <w:t xml:space="preserve"> corrected to </w:t>
+            </w:r>
+            <w:r>
+              <w:rPr>
+                <w:rFonts w:ascii="Consolas" w:hAnsi="Consolas"/>
+              </w:rPr>
+              <w:t xml:space="preserve">Monday, 31 August 2026</w:t>
+            </w:r>
+            <w:r>
+              <w:t xml:space="preserve">, weekday verified with </w:t>
+            </w:r>
+            <w:r>
+              <w:rPr>
+                <w:rFonts w:ascii="Consolas" w:hAnsi="Consolas"/>
+              </w:rPr>
+              <w:t xml:space="preserve">datetime</w:t>
+            </w:r>
+            <w:r>
+              <w:t xml:space="preserve">; 36 of 36 messages and the live endpoint moved with it. </w:t>
+            </w:r>
+            <w:r>
+              <w:rPr>
+                <w:b/>
+              </w:rPr>
+              <w:t xml:space="preserve">Bears on the sale as diligence hygiene only:</w:t>
+            </w:r>
+            <w:r>
+              <w:t xml:space="preserve"> the outreach is the instrument that captures continuing-use and transfer permissions (Section 6 gap, 0 of 20 sent), and it would have gone out quoting a deadline two weeks early and a study status that was not true. </w:t>
+            </w:r>
+            <w:r>
+              <w:rPr>
+                <w:b/>
+              </w:rPr>
+              <w:t xml:space="preserve">No change to sale status, guardrails, probability, packaging or any open item.</w:t>
             </w:r>
           </w:p>
         </w:tc>

</xml_diff>

<commit_message>
Trackers: record the recipient-set correction (IP sale tracker rev 11)
Co-Authored-By: Claude Opus 5 <noreply@anthropic.com>
Claude-Session: https://claude.ai/code/session_01W9UtE7X76spacWeSvBH7tv
</commit_message>
<xml_diff>
--- a/research/IP_SALE_TRACKER.docx
+++ b/research/IP_SALE_TRACKER.docx
@@ -355,7 +355,7 @@
               <w:spacing w:after="0"/>
             </w:pPr>
             <w:r>
-              <w:t xml:space="preserve">2026-08-14 (rev 10)</w:t>
+              <w:t xml:space="preserve">2026-08-14 (rev 11)</w:t>
             </w:r>
           </w:p>
         </w:tc>
@@ -386,7 +386,7 @@
               <w:spacing w:after="0"/>
             </w:pPr>
             <w:r>
-              <w:t xml:space="preserve">10</w:t>
+              <w:t xml:space="preserve">11</w:t>
             </w:r>
           </w:p>
         </w:tc>
@@ -3827,6 +3827,86 @@
             </w:pPr>
             <w:r>
               <w:t xml:space="preserve">Change</w:t>
+            </w:r>
+          </w:p>
+        </w:tc>
+      </w:tr>
+      <w:tr>
+        <w:tc>
+          <w:tcPr>
+            <w:tcW w:w="3120" w:type="dxa"/>
+          </w:tcPr>
+          <w:p>
+            <w:pPr>
+              <w:spacing w:after="0"/>
+            </w:pPr>
+            <w:r>
+              <w:t xml:space="preserve">11</w:t>
+            </w:r>
+          </w:p>
+        </w:tc>
+        <w:tc>
+          <w:tcPr>
+            <w:tcW w:w="3120" w:type="dxa"/>
+          </w:tcPr>
+          <w:p>
+            <w:pPr>
+              <w:spacing w:after="0"/>
+            </w:pPr>
+            <w:r>
+              <w:t xml:space="preserve">2026-08-14</w:t>
+            </w:r>
+          </w:p>
+        </w:tc>
+        <w:tc>
+          <w:tcPr>
+            <w:tcW w:w="3120" w:type="dxa"/>
+          </w:tcPr>
+          <w:p>
+            <w:pPr>
+              <w:spacing w:after="0"/>
+            </w:pPr>
+            <w:r>
+              <w:rPr>
+                <w:b/>
+              </w:rPr>
+              <w:t xml:space="preserve">Outreach recipient set corrected, and a blind leak caught inside it.</w:t>
+            </w:r>
+            <w:r>
+              <w:t xml:space="preserve"> The invitation goes to every evaluator who served as an EXPERT across Rung 2, Rung 2b and both arms; my list was 36 and omitted the reliability study's expert raters. </w:t>
+            </w:r>
+            <w:r>
+              <w:rPr>
+                <w:b/>
+              </w:rPr>
+              <w:t xml:space="preserve">Now 40, built person-centric so the three people who served in two studies each receive one letter rather than two.</w:t>
+            </w:r>
+            <w:r>
+              <w:t xml:space="preserve"> </w:t>
+            </w:r>
+            <w:r>
+              <w:rPr>
+                <w:b/>
+              </w:rPr>
+              <w:t xml:space="preserve">Bears directly on Section 6, the consent and release gap:</w:t>
+            </w:r>
+            <w:r>
+              <w:t xml:space="preserve"> this instrument is what captures continuing-use and transfer permissions in writing, the thing a successor's counsel asks for, and it now reaches 40 of the evaluators instead of 36. </w:t>
+            </w:r>
+            <w:r>
+              <w:rPr>
+                <w:b/>
+              </w:rPr>
+              <w:t xml:space="preserve">Guardrail 4 (protect the blind) was being breached by the outreach itself:</w:t>
+            </w:r>
+            <w:r>
+              <w:t xml:space="preserve"> RR-130 and RR-132 carry the study-internal title "JRS-naive expert professional" and the message printed it back to them, telling an unaided-arm reviewer that a comparison exists while the study is open. Fixed and asserted. </w:t>
+            </w:r>
+            <w:r>
+              <w:rPr>
+                <w:b/>
+              </w:rPr>
+              <w:t xml:space="preserve">No change to sale status, probability, packaging or any open item.</w:t>
             </w:r>
           </w:p>
         </w:tc>

</xml_diff>

<commit_message>
Trackers: record the Rung 2a removal (IP sale tracker rev 12)
Co-Authored-By: Claude Opus 5 <noreply@anthropic.com>
Claude-Session: https://claude.ai/code/session_01W9UtE7X76spacWeSvBH7tv
</commit_message>
<xml_diff>
--- a/research/IP_SALE_TRACKER.docx
+++ b/research/IP_SALE_TRACKER.docx
@@ -355,7 +355,7 @@
               <w:spacing w:after="0"/>
             </w:pPr>
             <w:r>
-              <w:t xml:space="preserve">2026-08-14 (rev 11)</w:t>
+              <w:t xml:space="preserve">2026-08-14 (rev 12)</w:t>
             </w:r>
           </w:p>
         </w:tc>
@@ -386,7 +386,7 @@
               <w:spacing w:after="0"/>
             </w:pPr>
             <w:r>
-              <w:t xml:space="preserve">11</w:t>
+              <w:t xml:space="preserve">12</w:t>
             </w:r>
           </w:p>
         </w:tc>
@@ -3827,6 +3827,68 @@
             </w:pPr>
             <w:r>
               <w:t xml:space="preserve">Change</w:t>
+            </w:r>
+          </w:p>
+        </w:tc>
+      </w:tr>
+      <w:tr>
+        <w:tc>
+          <w:tcPr>
+            <w:tcW w:w="3120" w:type="dxa"/>
+          </w:tcPr>
+          <w:p>
+            <w:pPr>
+              <w:spacing w:after="0"/>
+            </w:pPr>
+            <w:r>
+              <w:t xml:space="preserve">12</w:t>
+            </w:r>
+          </w:p>
+        </w:tc>
+        <w:tc>
+          <w:tcPr>
+            <w:tcW w:w="3120" w:type="dxa"/>
+          </w:tcPr>
+          <w:p>
+            <w:pPr>
+              <w:spacing w:after="0"/>
+            </w:pPr>
+            <w:r>
+              <w:t xml:space="preserve">2026-08-14</w:t>
+            </w:r>
+          </w:p>
+        </w:tc>
+        <w:tc>
+          <w:tcPr>
+            <w:tcW w:w="3120" w:type="dxa"/>
+          </w:tcPr>
+          <w:p>
+            <w:pPr>
+              <w:spacing w:after="0"/>
+            </w:pPr>
+            <w:r>
+              <w:rPr>
+                <w:b/>
+              </w:rPr>
+              <w:t xml:space="preserve">Rung 2a removed from the outreach on the owner's instruction; the list is 36, not 40.</w:t>
+            </w:r>
+            <w:r>
+              <w:t xml:space="preserve"> Rung 2a took part in the research but is not part of this invitation. Roster back to 39 and the three surplus links verified dead in production. </w:t>
+            </w:r>
+            <w:r>
+              <w:rPr>
+                <w:b/>
+              </w:rPr>
+              <w:t xml:space="preserve">Bears on Section 6 (consent and release):</w:t>
+            </w:r>
+            <w:r>
+              <w:t xml:space="preserve"> the continuing-use and transfer permissions this instrument captures will cover the 36 detection and comparison evaluators, not the reliability raters. </w:t>
+            </w:r>
+            <w:r>
+              <w:rPr>
+                <w:b/>
+              </w:rPr>
+              <w:t xml:space="preserve">No change to sale status, probability, packaging or any open item.</w:t>
             </w:r>
           </w:p>
         </w:tc>

</xml_diff>

<commit_message>
Trackers: record the commercial pause (IP sale tracker rev 14)
Co-Authored-By: Claude Opus 5 <noreply@anthropic.com>
</commit_message>
<xml_diff>
--- a/research/IP_SALE_TRACKER.docx
+++ b/research/IP_SALE_TRACKER.docx
@@ -355,7 +355,7 @@
               <w:spacing w:after="0"/>
             </w:pPr>
             <w:r>
-              <w:t xml:space="preserve">2026-08-15 (rev 13)</w:t>
+              <w:t xml:space="preserve">2026-08-15 (rev 14)</w:t>
             </w:r>
           </w:p>
         </w:tc>
@@ -386,7 +386,7 @@
               <w:spacing w:after="0"/>
             </w:pPr>
             <w:r>
-              <w:t xml:space="preserve">13</w:t>
+              <w:t xml:space="preserve">14</w:t>
             </w:r>
           </w:p>
         </w:tc>
@@ -3827,6 +3827,86 @@
             </w:pPr>
             <w:r>
               <w:t xml:space="preserve">Change</w:t>
+            </w:r>
+          </w:p>
+        </w:tc>
+      </w:tr>
+      <w:tr>
+        <w:tc>
+          <w:tcPr>
+            <w:tcW w:w="3120" w:type="dxa"/>
+          </w:tcPr>
+          <w:p>
+            <w:pPr>
+              <w:spacing w:after="0"/>
+            </w:pPr>
+            <w:r>
+              <w:t xml:space="preserve">14</w:t>
+            </w:r>
+          </w:p>
+        </w:tc>
+        <w:tc>
+          <w:tcPr>
+            <w:tcW w:w="3120" w:type="dxa"/>
+          </w:tcPr>
+          <w:p>
+            <w:pPr>
+              <w:spacing w:after="0"/>
+            </w:pPr>
+            <w:r>
+              <w:t xml:space="preserve">2026-08-15</w:t>
+            </w:r>
+          </w:p>
+        </w:tc>
+        <w:tc>
+          <w:tcPr>
+            <w:tcW w:w="3120" w:type="dxa"/>
+          </w:tcPr>
+          <w:p>
+            <w:pPr>
+              <w:spacing w:after="0"/>
+            </w:pPr>
+            <w:r>
+              <w:rPr>
+                <w:b/>
+              </w:rPr>
+              <w:t xml:space="preserve">The paid offer is withdrawn from the public site until the research programme is complete.</w:t>
+            </w:r>
+            <w:r>
+              <w:t xml:space="preserve"> Five commercial pages unlinked, noindexed and out of the sitemap; no price on any indexable page; the free seven-point check stays. Nothing deleted, restore is a single </w:t>
+            </w:r>
+            <w:r>
+              <w:rPr>
+                <w:rFonts w:ascii="Consolas" w:hAnsi="Consolas"/>
+              </w:rPr>
+              <w:t xml:space="preserve">git revert</w:t>
+            </w:r>
+            <w:r>
+              <w:t xml:space="preserve">. </w:t>
+            </w:r>
+            <w:r>
+              <w:rPr>
+                <w:b/>
+              </w:rPr>
+              <w:t xml:space="preserve">Effect on the sale:</w:t>
+            </w:r>
+            <w:r>
+              <w:t xml:space="preserve"> the site now reads as a research programme again rather than a programme with three unpriced-through services attached, which is closer to the position guardrail 5 assumes. Revenue remains $0 and no tier had a working engine behind it, so nothing that was earning has stopped. </w:t>
+            </w:r>
+            <w:r>
+              <w:rPr>
+                <w:b/>
+              </w:rPr>
+              <w:t xml:space="preserve">Open item added:</w:t>
+            </w:r>
+            <w:r>
+              <w:t xml:space="preserve"> the 36 evaluator messages still quote the three prices and now contradict the site. </w:t>
+            </w:r>
+            <w:r>
+              <w:rPr>
+                <w:b/>
+              </w:rPr>
+              <w:t xml:space="preserve">No change to sale status, probability or packaging.</w:t>
             </w:r>
           </w:p>
         </w:tc>

</xml_diff>